<commit_message>
fix thread exhaustion, joystick animation, return-to-center, camera polling
- Remove sio.emit from background camera init thread (was creating
  engineio background tasks that exhausted the thread pool)
- Remove status echo from on_set_speeds (60/s joystick frames each
  spawned a thread via start_background_task, hitting the 378-thread
  cgroup limit)
- Replace camera_status SocketIO push with client-side HTTP polling
  of /api/camera_status every 3s
- Add GRAB_THRESHOLD (6px) guard so accidental touchmove after tap
  doesn't cancel the joystick grab animation
- Remove (joyX !== 0 || joyY !== 0) guard in touchend so return-to-center
  works even on fastest click-release
- Reduce camera capture rate 20->10 fps to lower CPU load
- Add async_mode='threading' explicitly
- Fix tests for removed status echo and camera_status changes
</commit_message>
<xml_diff>
--- a/R2_Motor_Control_Plan.docx
+++ b/R2_Motor_Control_Plan.docx
@@ -8,7 +8,7 @@
         <w:jc w:val="center"/>
       </w:pPr>
       <w:r>
-        <w:t>R2 Motor Control System</w:t>
+        <w:t>R2 Control Bridge</w:t>
       </w:r>
     </w:p>
     <w:p>
@@ -17,7 +17,7 @@
         <w:jc w:val="center"/>
       </w:pPr>
       <w:r>
-        <w:t>Raspberry Pi Zero W + 2 × Cytron MDD20A — 4-Motor Control</w:t>
+        <w:t>Raspberry Pi Zero W + 2 × Cytron MDD20A — 4-Motor Control with Camera &amp; Virtual Joystick</w:t>
       </w:r>
     </w:p>
     <w:p/>
@@ -31,7 +31,15 @@
     </w:p>
     <w:p>
       <w:r>
-        <w:t>This project turns a Raspberry Pi Zero W into a WiFi-enabled motor controller for four brushed DC motors. Two Cytron MDD20A dual-channel H-bridge drivers provide 20A per channel (60A peak) for high-power motors. A web-based dashboard served from the Pi lets a phone or laptop control all four motors in real time over WiFi, with sub-20ms latency.</w:t>
+        <w:t>This project turns a Raspberry Pi Zero W into a WiFi-enabled motor controller for four brushed DC motors. Two Cytron MDD20A dual-channel H-bridge drivers provide 20A per channel (60A peak) for high-power motors. A web-based dashboard served from the Pi lets a phone or laptop control all four motors in real time over WiFi, with sub-15ms latency. An OV5647 camera module provides a live MJPEG video feed in the dashboard.</w:t>
+      </w:r>
+    </w:p>
+    <w:p>
+      <w:r>
+        <w:rPr>
+          <w:b/>
+        </w:rPr>
+        <w:t>Key capabilities:</w:t>
       </w:r>
     </w:p>
     <w:p>
@@ -39,35 +47,69 @@
         <w:pStyle w:val="ListBullet"/>
       </w:pPr>
       <w:r>
-        <w:t>Key capabilities:</w:t>
+        <w:t>Virtual joystick with differential drive mapping (FL/RL = y+x, FR/RR = y-x)</w:t>
       </w:r>
     </w:p>
     <w:p>
+      <w:pPr>
+        <w:pStyle w:val="ListBullet"/>
+      </w:pPr>
       <w:r>
-        <w:t>Independent speed &amp; direction control for 4 motors</w:t>
+        <w:t>Auto-Center toggle + adjustable return-to-center damping (Joystick Speed)</w:t>
       </w:r>
     </w:p>
     <w:p>
+      <w:pPr>
+        <w:pStyle w:val="ListBullet"/>
+      </w:pPr>
       <w:r>
-        <w:t>Web dashboard accessible from any device on the network</w:t>
+        <w:t>Max Speed Limiter scales motor output proportionally (0–100%)</w:t>
       </w:r>
     </w:p>
     <w:p>
+      <w:pPr>
+        <w:pStyle w:val="ListBullet"/>
+      </w:pPr>
       <w:r>
-        <w:t>Real-time control via WebSocket (~10-15ms round trip)</w:t>
+        <w:t>Live OV5647 camera feed (640×480 MJPEG) embedded in dashboard</w:t>
       </w:r>
     </w:p>
     <w:p>
+      <w:pPr>
+        <w:pStyle w:val="ListBullet"/>
+      </w:pPr>
+      <w:r>
+        <w:t>Real-time control via WebSocket (~10–15ms round trip)</w:t>
+      </w:r>
+    </w:p>
+    <w:p>
+      <w:pPr>
+        <w:pStyle w:val="ListBullet"/>
+      </w:pPr>
       <w:r>
         <w:t>Smooth PWM at 20kHz (inaudible, no motor whine)</w:t>
       </w:r>
     </w:p>
     <w:p>
+      <w:pPr>
+        <w:pStyle w:val="ListBullet"/>
+      </w:pPr>
       <w:r>
         <w:t>Emergency stop (instant kill all motors)</w:t>
       </w:r>
     </w:p>
     <w:p>
+      <w:pPr>
+        <w:pStyle w:val="ListBullet"/>
+      </w:pPr>
+      <w:r>
+        <w:t>Reconnection overlay with countdown when WebSocket drops</w:t>
+      </w:r>
+    </w:p>
+    <w:p>
+      <w:pPr>
+        <w:pStyle w:val="ListBullet"/>
+      </w:pPr>
       <w:r>
         <w:t>Auto-start on boot — headless operation, no monitor or keyboard needed</w:t>
       </w:r>
@@ -445,6 +487,48 @@
           <w:p>
             <w:r>
               <w:t>Status indicator on GPIO5</w:t>
+            </w:r>
+          </w:p>
+        </w:tc>
+      </w:tr>
+      <w:tr>
+        <w:tc>
+          <w:tcPr>
+            <w:tcW w:type="dxa" w:w="2160"/>
+          </w:tcPr>
+          <w:p>
+            <w:r>
+              <w:t>8</w:t>
+            </w:r>
+          </w:p>
+        </w:tc>
+        <w:tc>
+          <w:tcPr>
+            <w:tcW w:type="dxa" w:w="2160"/>
+          </w:tcPr>
+          <w:p>
+            <w:r>
+              <w:t>OV5647 camera module</w:t>
+            </w:r>
+          </w:p>
+        </w:tc>
+        <w:tc>
+          <w:tcPr>
+            <w:tcW w:type="dxa" w:w="2160"/>
+          </w:tcPr>
+          <w:p>
+            <w:r>
+              <w:t>1</w:t>
+            </w:r>
+          </w:p>
+        </w:tc>
+        <w:tc>
+          <w:tcPr>
+            <w:tcW w:type="dxa" w:w="2160"/>
+          </w:tcPr>
+          <w:p>
+            <w:r>
+              <w:t>CSI interface, 640×480 MJPEG stream</w:t>
             </w:r>
           </w:p>
         </w:tc>
@@ -1262,6 +1346,28 @@
           </w:tcPr>
           <w:p>
             <w:r>
+              <w:t>Camera</w:t>
+            </w:r>
+          </w:p>
+        </w:tc>
+        <w:tc>
+          <w:tcPr>
+            <w:tcW w:type="dxa" w:w="4320"/>
+          </w:tcPr>
+          <w:p>
+            <w:r>
+              <w:t>picamera2 — OV5647 sensor, 640×480 MJPEG stream on /video_feed</w:t>
+            </w:r>
+          </w:p>
+        </w:tc>
+      </w:tr>
+      <w:tr>
+        <w:tc>
+          <w:tcPr>
+            <w:tcW w:type="dxa" w:w="4320"/>
+          </w:tcPr>
+          <w:p>
+            <w:r>
               <w:t>Frontend</w:t>
             </w:r>
           </w:p>
@@ -1272,7 +1378,29 @@
           </w:tcPr>
           <w:p>
             <w:r>
-              <w:t>Plain HTML/CSS/JS — no framework dependencies, touch-friendly sliders</w:t>
+              <w:t>Plain HTML/CSS/JS — virtual joystick, touch-friendly, no framework dependencies</w:t>
+            </w:r>
+          </w:p>
+        </w:tc>
+      </w:tr>
+      <w:tr>
+        <w:tc>
+          <w:tcPr>
+            <w:tcW w:type="dxa" w:w="4320"/>
+          </w:tcPr>
+          <w:p>
+            <w:r>
+              <w:t>Socket.IO Client</w:t>
+            </w:r>
+          </w:p>
+        </w:tc>
+        <w:tc>
+          <w:tcPr>
+            <w:tcW w:type="dxa" w:w="4320"/>
+          </w:tcPr>
+          <w:p>
+            <w:r>
+              <w:t>v4.7.5 served locally from static/socket.io.min.js (no CDN dependency)</w:t>
             </w:r>
           </w:p>
         </w:tc>
@@ -1294,7 +1422,7 @@
           </w:tcPr>
           <w:p>
             <w:r>
-              <w:t>systemd — auto-starts pigpiod + web server on boot</w:t>
+              <w:t>systemd — auto-starts pigpiod + web server + watchdog on boot</w:t>
             </w:r>
           </w:p>
         </w:tc>
@@ -1389,7 +1517,7 @@
           </w:tcPr>
           <w:p>
             <w:r>
-              <w:t>Connects to pigpiod, set_speed(motor, -100..100), stop_all(), 20kHz PWM</w:t>
+              <w:t>Connects to pigpiod, set_speed(motor, -100..100), stop_all(), 20kHz DMA PWM</w:t>
             </w:r>
           </w:p>
         </w:tc>
@@ -1421,7 +1549,7 @@
           </w:tcPr>
           <w:p>
             <w:r>
-              <w:t>Binds 0.0.0.0:5000, prints IP on startup, handles WebSocket events</w:t>
+              <w:t>Binds 0.0.0.0:5000, camera init, MJPEG /video_feed, WebSocket events</w:t>
             </w:r>
           </w:p>
         </w:tc>
@@ -1453,7 +1581,39 @@
           </w:tcPr>
           <w:p>
             <w:r>
-              <w:t>4 touch sliders (-100 to +100), STOP button, responsive layout</w:t>
+              <w:t>Virtual joystick, Auto-Center, Speed/Max Speed sliders, camera, reconnect overlay</w:t>
+            </w:r>
+          </w:p>
+        </w:tc>
+      </w:tr>
+      <w:tr>
+        <w:tc>
+          <w:tcPr>
+            <w:tcW w:type="dxa" w:w="2880"/>
+          </w:tcPr>
+          <w:p>
+            <w:r>
+              <w:t>static/socket.io.min.js</w:t>
+            </w:r>
+          </w:p>
+        </w:tc>
+        <w:tc>
+          <w:tcPr>
+            <w:tcW w:type="dxa" w:w="2880"/>
+          </w:tcPr>
+          <w:p>
+            <w:r>
+              <w:t>SocketIO client library</w:t>
+            </w:r>
+          </w:p>
+        </w:tc>
+        <w:tc>
+          <w:tcPr>
+            <w:tcW w:type="dxa" w:w="2880"/>
+          </w:tcPr>
+          <w:p>
+            <w:r>
+              <w:t>v4.7.5 — served locally so CDN is not required</w:t>
             </w:r>
           </w:p>
         </w:tc>
@@ -1517,7 +1677,7 @@
           </w:tcPr>
           <w:p>
             <w:r>
-              <w:t>After=pigpiod.service, Restart=on-failure</w:t>
+              <w:t>After=pigpiod.service, Restart=on-failure, RestartSec=5</w:t>
             </w:r>
           </w:p>
         </w:tc>
@@ -1549,7 +1709,39 @@
           </w:tcPr>
           <w:p>
             <w:r>
-              <w:t>After=motor_control.service pigpiod.service, Requires=motor_control.service pigpiod.service</w:t>
+              <w:t>After=motor_control.service pigpiod.service, Requires=pigpiod.service</w:t>
+            </w:r>
+          </w:p>
+        </w:tc>
+      </w:tr>
+      <w:tr>
+        <w:tc>
+          <w:tcPr>
+            <w:tcW w:type="dxa" w:w="2880"/>
+          </w:tcPr>
+          <w:p>
+            <w:r>
+              <w:t>deploy.sh</w:t>
+            </w:r>
+          </w:p>
+        </w:tc>
+        <w:tc>
+          <w:tcPr>
+            <w:tcW w:type="dxa" w:w="2880"/>
+          </w:tcPr>
+          <w:p>
+            <w:r>
+              <w:t>Deployment script</w:t>
+            </w:r>
+          </w:p>
+        </w:tc>
+        <w:tc>
+          <w:tcPr>
+            <w:tcW w:type="dxa" w:w="2880"/>
+          </w:tcPr>
+          <w:p>
+            <w:r>
+              <w:t>Copies all files and installs systemd services</w:t>
             </w:r>
           </w:p>
         </w:tc>
@@ -1566,19 +1758,23 @@
     </w:p>
     <w:p>
       <w:r>
-        <w:t>1. User drags a slider in the phone browser</w:t>
+        <w:t>1. User drags the virtual joystick in the phone browser</w:t>
         <w:br/>
-        <w:t>2. JavaScript throttles to 30 updates/sec, sends via WebSocket</w:t>
+        <w:t>2. JavaScript computes target speeds via differential drive: FL/RL = y+x, FR/RR = y-x</w:t>
         <w:br/>
-        <w:t>3. Flask-SocketIO receives the event ('set_speed')</w:t>
+        <w:t>3. rAF animation loop interpolates motor speeds toward target (return-to-center damping)</w:t>
         <w:br/>
-        <w:t>4. app.py calls motor_control.set_speed(motor_id, value)</w:t>
+        <w:t>4. Throttled to 30 updates/sec, sent via WebSocket as set_speeds event</w:t>
         <w:br/>
-        <w:t>5. motor_control.py converts speed to DIR (high/low) + PWM duty cycle (0-1000)</w:t>
+        <w:t>5. Flask-SocketIO receives the event with 4 motor values</w:t>
         <w:br/>
-        <w:t>6. pigpio writes to GPIO registers via /dev/gpiomem (DMA, sub-1ms)</w:t>
+        <w:t>6. app.py calls motor_control.set_speed(motor_id, value) for each motor</w:t>
         <w:br/>
-        <w:t>7. MDD20A drives the motor at the commanded speed</w:t>
+        <w:t>7. motor_control.py converts speed to DIR (high/low) + PWM duty cycle (0-1000)</w:t>
+        <w:br/>
+        <w:t>8. pigpio writes to GPIO registers via /dev/gpiomem (DMA, sub-1ms)</w:t>
+        <w:br/>
+        <w:t>9. MDD20A drives each motor at the commanded speed</w:t>
         <w:br/>
         <w:br/>
         <w:t>Total latency: ~10-15ms round trip — perceived as instant by the user.</w:t>
@@ -1597,12 +1793,12 @@
         <w:pStyle w:val="Heading2"/>
       </w:pPr>
       <w:r>
-        <w:t>Independent 4-Motor Control</w:t>
+        <w:t>Virtual Joystick with Differential Drive</w:t>
       </w:r>
     </w:p>
     <w:p>
       <w:r>
-        <w:t>Each of the four motors has its own slider (-100 to +100). Negative values run the motor in reverse, positive values forward. Motors can be controlled independently or in any combination.</w:t>
+        <w:t>A single virtual joystick (touch circle) controls all 4 motors via differential drive mapping: FL/RL = y+x, FR/RR = y-x. Vertical tilt drives forward/backward, horizontal tilt turns. The joystick renders as a draggable dot within a circular boundary, showing real-time X/Y values.</w:t>
       </w:r>
     </w:p>
     <w:p>
@@ -1610,12 +1806,38 @@
         <w:pStyle w:val="Heading2"/>
       </w:pPr>
       <w:r>
-        <w:t>Real-Time Web Dashboard</w:t>
+        <w:t>Auto-Center with Adjustable Damping</w:t>
       </w:r>
     </w:p>
     <w:p>
       <w:r>
-        <w:t>The web interface uses WebSockets for bidirectional communication — no page refreshes. Slider movements are reflected at the motor within ~15ms. The dashboard works on any modern browser (Chrome, Safari, Firefox).</w:t>
+        <w:t>When enabled, the joystick returns to center on release and motor speeds smoothly glide back to zero. The Joystick Speed slider (50–3050ms) controls the return-to-center damping time — higher values give a slower, more gradual deceleration. When disabled, motors hold their last commanded speed.</w:t>
+      </w:r>
+    </w:p>
+    <w:p>
+      <w:pPr>
+        <w:pStyle w:val="Heading2"/>
+      </w:pPr>
+      <w:r>
+        <w:t>Max Speed Limiter</w:t>
+      </w:r>
+    </w:p>
+    <w:p>
+      <w:r>
+        <w:t>Scales the motor output proportionally from 0% to 100%. At 50% (default), the joystick's full throw produces only 50% PWM duty cycle. Useful for limiting speed during testing or indoor use without changing the joystick sensitivity curve.</w:t>
+      </w:r>
+    </w:p>
+    <w:p>
+      <w:pPr>
+        <w:pStyle w:val="Heading2"/>
+      </w:pPr>
+      <w:r>
+        <w:t>Live Camera Feed</w:t>
+      </w:r>
+    </w:p>
+    <w:p>
+      <w:r>
+        <w:t>An OV5647 camera module (CSI interface) streams 640×480 MJPEG video via a dedicated /video_feed endpoint. The feed auto-reconnects when WebSocket reconnection occurs (cache-busting timestamp). The MJPEG generator uses stream_with_context + GeneratorExit handling to prevent thread exhaustion on disconnect/reconnect loops. Positioned below the connection status in the dashboard.</w:t>
       </w:r>
     </w:p>
     <w:p>
@@ -1636,6 +1858,19 @@
         <w:pStyle w:val="Heading2"/>
       </w:pPr>
       <w:r>
+        <w:t>Reconnection Overlay</w:t>
+      </w:r>
+    </w:p>
+    <w:p>
+      <w:r>
+        <w:t>When the WebSocket disconnects, the dashboard dims all controls to 40% opacity and shows a glowing red "Reconnecting" overlay with a countdown timer ("in N seconds"). Retries every 5 seconds. On reconnection, the overlay disappears and full control is restored.</w:t>
+      </w:r>
+    </w:p>
+    <w:p>
+      <w:pPr>
+        <w:pStyle w:val="Heading2"/>
+      </w:pPr>
+      <w:r>
         <w:t>20kHz Silent PWM</w:t>
       </w:r>
     </w:p>
@@ -1649,12 +1884,25 @@
         <w:pStyle w:val="Heading2"/>
       </w:pPr>
       <w:r>
+        <w:t>Local Socket.IO Serving</w:t>
+      </w:r>
+    </w:p>
+    <w:p>
+      <w:r>
+        <w:t>The Socket.IO client library (v4.7.5) is served from the Pi itself at static/socket.io.min.js. No CDN dependency — works completely offline, no internet connection required on the phone.</w:t>
+      </w:r>
+    </w:p>
+    <w:p>
+      <w:pPr>
+        <w:pStyle w:val="Heading2"/>
+      </w:pPr>
+      <w:r>
         <w:t>Headless Auto-Start</w:t>
       </w:r>
     </w:p>
     <w:p>
       <w:r>
-        <w:t>On power-up, the Pi automatically starts the pigpio daemon and the Flask web server. No monitor, keyboard, or manual login required — just power on and connect.</w:t>
+        <w:t>On power-up, the Pi automatically starts the pigpio daemon, Flask web server, and watchdog service. No monitor, keyboard, or manual login required — just power on and connect.</w:t>
       </w:r>
     </w:p>
     <w:p>
@@ -1680,7 +1928,7 @@
     </w:p>
     <w:p>
       <w:r>
-        <w:t>The dashboard is designed for phone use: large sliders with thick touch targets, no tiny buttons, responsive layout that fits mobile screens.</w:t>
+        <w:t>The dashboard is designed for phone use: large virtual joystick (200px), responsive layout that scrolls vertically on small screens, thick touch targets, camera feed capped at 240px width.</w:t>
       </w:r>
     </w:p>
     <w:p>
@@ -1693,7 +1941,7 @@
     </w:p>
     <w:p>
       <w:r>
-        <w:t>motor_control.py is a standalone class that can be imported and used from other Python scripts, not just the web server. This allows future expansion (e.g., adding a joystick, autonomous mode, or ROS integration).</w:t>
+        <w:t>motor_control.py is a standalone class that can be imported and used from other Python scripts, not just the web server. This allows future expansion (e.g., autonomous mode, ROS integration).</w:t>
       </w:r>
     </w:p>
     <w:p>
@@ -1714,7 +1962,7 @@
     </w:p>
     <w:p>
       <w:r>
-        <w:t>Control a 4-wheel or tracked robot from your phone. The differential-drive layout (left stick = left motors, right stick = right motors) enables intuitive driving: forward/backward/turn-in-place. The Pi Zero W mounts on the robot chassis.</w:t>
+        <w:t>Control a 4-wheel or tracked robot from your phone. The differential-drive joystick enables intuitive driving: forward/backward/turn-in-place. The Pi Zero W and camera mount on the robot chassis.</w:t>
       </w:r>
     </w:p>
     <w:p>
@@ -1727,7 +1975,7 @@
     </w:p>
     <w:p>
       <w:r>
-        <w:t>Test and characterize multiple motors individually or simultaneously. Set different speeds on each motor to compare performance, measure current draw, or run burn-in tests.</w:t>
+        <w:t>Test and characterize multiple motors individually or simultaneously via the independent motor API.</w:t>
       </w:r>
     </w:p>
     <w:p>
@@ -1740,7 +1988,7 @@
     </w:p>
     <w:p>
       <w:r>
-        <w:t>Control a 4-motor conveyor system from a safe distance. Individual motor control allows differential belt speeds for sorting or positioning.</w:t>
+        <w:t>Control a 4-motor conveyor system from a safe distance with individual speed control.</w:t>
       </w:r>
     </w:p>
     <w:p>
@@ -1753,7 +2001,7 @@
     </w:p>
     <w:p>
       <w:r>
-        <w:t>Learn motor control, PWM, web services, and embedded Linux all in one project. The code is well-documented and modular, making it suitable for teaching robotics or IoT concepts.</w:t>
+        <w:t>Learn motor control, PWM, web services, computer vision, and embedded Linux all in one project.</w:t>
       </w:r>
     </w:p>
     <w:p>
@@ -1766,7 +2014,7 @@
     </w:p>
     <w:p>
       <w:r>
-        <w:t>Use as a rapid prototyping platform for motor control algorithms. The WebSocket interface makes it easy to write custom control UIs or integrate with higher-level systems like ROS.</w:t>
+        <w:t>Rapid prototyping platform for motor control algorithms. WebSocket interface makes it easy to write custom control UIs or integrate with higher-level systems.</w:t>
       </w:r>
     </w:p>
     <w:p>
@@ -1801,6 +2049,11 @@
       </w:r>
     </w:p>
     <w:p>
+      <w:r>
+        <w:t>OV5647 camera module connected via CSI ribbon cable.</w:t>
+      </w:r>
+    </w:p>
+    <w:p>
       <w:pPr>
         <w:pStyle w:val="Heading2"/>
       </w:pPr>
@@ -1810,7 +2063,7 @@
     </w:p>
     <w:p>
       <w:r>
-        <w:t>1. Install system packages: sudo apt update &amp;&amp; sudo apt install -y pigpio python3-pip</w:t>
+        <w:t>1. Install system packages: sudo apt update &amp;&amp; sudo apt install -y pigpio python3-pip python3-picamera2</w:t>
       </w:r>
     </w:p>
     <w:p>
@@ -1825,37 +2078,48 @@
     </w:p>
     <w:p>
       <w:r>
-        <w:t>4. Wire the Pi to the MDD20A drivers per the wiring table in Section 2.2</w:t>
+        <w:t>4. Verify camera: libcamera-hello --timeout 2000 (should show camera preview)</w:t>
       </w:r>
     </w:p>
     <w:p>
       <w:r>
-        <w:t>5. Connect the status LED (with 220Ω resistor) from GPIO5 to GND</w:t>
+        <w:t>5. Wire the Pi to the MDD20A drivers per the wiring table in Section 2.2</w:t>
       </w:r>
     </w:p>
     <w:p>
       <w:r>
-        <w:t>6. Connect motors to the MDD20A output terminals</w:t>
+        <w:t>6. Connect the status LED (with 220Ω resistor) from GPIO5 to GND</w:t>
       </w:r>
     </w:p>
     <w:p>
       <w:r>
-        <w:t>7. Connect motor battery (6-30V) to MDD20A VB+/VB-</w:t>
+        <w:t>7. Connect motors to the MDD20A output terminals</w:t>
       </w:r>
     </w:p>
     <w:p>
       <w:r>
-        <w:t>8. Power the Pi Zero W via microUSB</w:t>
+        <w:t>8. Connect motor battery (6-30V) to MDD20A VB+/VB-</w:t>
       </w:r>
     </w:p>
     <w:p>
       <w:r>
-        <w:t>9. Copy motor_control.py, app.py, watchdog.py, and templates/index.html to /home/r2tele/motor_control/</w:t>
+        <w:t>9. Power the Pi Zero W via microUSB</w:t>
       </w:r>
     </w:p>
     <w:p>
       <w:r>
-        <w:t>10. Create and enable systemd services:</w:t>
+        <w:t>10. Copy all source files to /home/r2tele/motor_control/:</w:t>
+        <w:br/>
+        <w:t xml:space="preserve">  motor_control.py, app.py, watchdog.py, deploy.sh</w:t>
+        <w:br/>
+        <w:t xml:space="preserve">  templates/index.html</w:t>
+        <w:br/>
+        <w:t xml:space="preserve">  static/socket.io.min.js</w:t>
+      </w:r>
+    </w:p>
+    <w:p>
+      <w:r>
+        <w:t>11. Create and enable systemd services:</w:t>
         <w:br/>
         <w:t xml:space="preserve">  sudo cp motor_control.service /etc/systemd/system/</w:t>
         <w:br/>
@@ -1868,7 +2132,7 @@
     </w:p>
     <w:p>
       <w:r>
-        <w:t>11. Reboot: sudo reboot</w:t>
+        <w:t>12. Reboot: sudo reboot</w:t>
       </w:r>
     </w:p>
     <w:p>
@@ -1997,7 +2261,7 @@
         <w:br/>
         <w:t xml:space="preserve">        → motor_control (app.py) starts after pigpiod</w:t>
         <w:br/>
-        <w:t xml:space="preserve">        → watchdog starts after both are active</w:t>
+        <w:t xml:space="preserve">        → watchdog starts after pigpiod (NOT bound to motor_control)</w:t>
         <w:br/>
         <w:t xml:space="preserve">        → watchdog confirms all alive → GPIO5 solid on</w:t>
       </w:r>
@@ -2015,6 +2279,9 @@
         <w:t xml:space="preserve">  • LED switches to fast blink during recovery</w:t>
         <w:br/>
         <w:t xml:space="preserve">  • After 3 failed restart attempts, LED shows fatal error pattern</w:t>
+        <w:br/>
+        <w:br/>
+        <w:t>Note: watchdog.service does NOT include motor_control.service in its Requires= directive. This was intentional — stopping motor_control manually (e.g., for maintenance) will not kill the watchdog. The watchdog can then detect the stoppage and restart motor_control automatically.</w:t>
       </w:r>
     </w:p>
     <w:p>
@@ -2089,7 +2356,15 @@
         <w:pStyle w:val="ListBullet"/>
       </w:pPr>
       <w:r>
-        <w:t>Manual service restart → watchdog detects it came back and restores solid LED</w:t>
+        <w:t>Manual service stop → watchdog survives (not coupled) and auto-restarts motor_control</w:t>
+      </w:r>
+    </w:p>
+    <w:p>
+      <w:pPr>
+        <w:pStyle w:val="ListBullet"/>
+      </w:pPr>
+      <w:r>
+        <w:t>MJPEG thread exhaustion → GeneratorExit handler cleans up threads on disconnect</w:t>
       </w:r>
     </w:p>
     <w:p>
@@ -2105,7 +2380,7 @@
         <w:pStyle w:val="ListBullet"/>
       </w:pPr>
       <w:r>
-        <w:t>Differential drive mode: add a tank-style control layout (left stick = left motors, right stick = right motors)</w:t>
+        <w:t>Encoder feedback for closed-loop PID speed control</w:t>
       </w:r>
     </w:p>
     <w:p>
@@ -2121,15 +2396,7 @@
         <w:pStyle w:val="ListBullet"/>
       </w:pPr>
       <w:r>
-        <w:t>Speed feedback from encoders for closed-loop PID control</w:t>
-      </w:r>
-    </w:p>
-    <w:p>
-      <w:pPr>
-        <w:pStyle w:val="ListBullet"/>
-      </w:pPr>
-      <w:r>
-        <w:t>WiFi AP mode: Pi creates its own network so your phone connects directly without a hotspot</w:t>
+        <w:t>WiFi AP mode: Pi creates its own network so phone connects directly without a hotspot</w:t>
       </w:r>
     </w:p>
     <w:p>
@@ -2146,6 +2413,14 @@
       </w:pPr>
       <w:r>
         <w:t>ROS 2 integration for advanced robotics applications</w:t>
+      </w:r>
+    </w:p>
+    <w:p>
+      <w:pPr>
+        <w:pStyle w:val="ListBullet"/>
+      </w:pPr>
+      <w:r>
+        <w:t>OLED display for IP address and status (no SSH required)</w:t>
       </w:r>
     </w:p>
     <w:p>
@@ -2170,7 +2445,7 @@
         <w:br/>
         <w:t>├── motor_control.py          # Hardware abstraction — pigpio DMA PWM, 4 motors</w:t>
         <w:br/>
-        <w:t>├── app.py                    # Flask + SocketIO web server</w:t>
+        <w:t>├── app.py                    # Flask + SocketIO + camera MJPEG server</w:t>
         <w:br/>
         <w:t>├── watchdog.py               # Service monitor + GPIO5 LED controller</w:t>
         <w:br/>
@@ -2182,7 +2457,11 @@
         <w:br/>
         <w:t>├── templates/</w:t>
         <w:br/>
-        <w:t>│   └── index.html            # Web dashboard (4 sliders + STOP)</w:t>
+        <w:t>│   └── index.html            # Virtual joystick UI, camera feed, reconnect overlay</w:t>
+        <w:br/>
+        <w:t>├── static/</w:t>
+        <w:br/>
+        <w:t>│   └── socket.io.min.js      # SocketIO client v4.7.5 (local, no CDN)</w:t>
         <w:br/>
         <w:t>└── tests/</w:t>
         <w:br/>

</xml_diff>